<commit_message>
feat: sync software CVs (EN & VI docx/pdf) with Amazing Tech and ftacode projects
</commit_message>
<xml_diff>
--- a/doc/CV_Software_Engineer_EN.docx
+++ b/doc/CV_Software_Engineer_EN.docx
@@ -1,6 +1,56 @@
 
-<file path=word/document.xml><?xml version="1.0" encoding="utf-8"?>
-<w:document xmlns:wpc="http://schemas.microsoft.com/office/word/2010/wordprocessingCanvas" xmlns:cx="http://schemas.microsoft.com/office/drawing/2014/chartex" xmlns:cx1="http://schemas.microsoft.com/office/drawing/2015/9/8/chartex" xmlns:cx2="http://schemas.microsoft.com/office/drawing/2015/10/21/chartex" xmlns:cx3="http://schemas.microsoft.com/office/drawing/2016/5/9/chartex" xmlns:cx4="http://schemas.microsoft.com/office/drawing/2016/5/10/chartex" xmlns:cx5="http://schemas.microsoft.com/office/drawing/2016/5/11/chartex" xmlns:cx6="http://schemas.microsoft.com/office/drawing/2016/5/12/chartex" xmlns:cx7="http://schemas.microsoft.com/office/drawing/2016/5/13/chartex" xmlns:cx8="http://schemas.microsoft.com/office/drawing/2016/5/14/chartex" xmlns:mc="http://schemas.openxmlformats.org/markup-compatibility/2006" xmlns:aink="http://schemas.microsoft.com/office/drawing/2016/ink" xmlns:am3d="http://schemas.microsoft.com/office/drawing/2017/model3d" xmlns:o="urn:schemas-microsoft-com:office:office" xmlns:oel="http://schemas.microsoft.com/office/2019/extlst" xmlns:r="http://schemas.openxmlformats.org/officeDocument/2006/relationships" xmlns:m="http://schemas.openxmlformats.org/officeDocument/2006/math" xmlns:v="urn:schemas-microsoft-com:vml" xmlns:wp14="http://schemas.microsoft.com/office/word/2010/wordprocessingDrawing" xmlns:wp="http://schemas.openxmlformats.org/drawingml/2006/wordprocessingDrawing" xmlns:w10="urn:schemas-microsoft-com:office:word" xmlns:w="http://schemas.openxmlformats.org/wordprocessingml/2006/main" xmlns:w14="http://schemas.microsoft.com/office/word/2010/wordml" xmlns:w15="http://schemas.microsoft.com/office/word/2012/wordml" xmlns:w16cex="http://schemas.microsoft.com/office/word/2018/wordml/cex" xmlns:w16cid="http://schemas.microsoft.com/office/word/2016/wordml/cid" xmlns:w16="http://schemas.microsoft.com/office/word/2018/wordml" xmlns:w16du="http://schemas.microsoft.com/office/word/2023/wordml/word16du" xmlns:w16sdtdh="http://schemas.microsoft.com/office/word/2020/wordml/sdtdatahash" xmlns:w16sdtfl="http://schemas.microsoft.com/office/word/2024/wordml/sdtformatlock" xmlns:w16se="http://schemas.microsoft.com/office/word/2015/wordml/symex" xmlns:wpg="http://schemas.microsoft.com/office/word/2010/wordprocessingGroup" xmlns:wpi="http://schemas.microsoft.com/office/word/2010/wordprocessingInk" xmlns:wne="http://schemas.microsoft.com/office/word/2006/wordml" xmlns:wps="http://schemas.microsoft.com/office/word/2010/wordprocessingShape" mc:Ignorable="w14 w15 w16se w16cid w16 w16cex w16sdtdh w16sdtfl w16du wp14">
+<file path=docProps\app.xml><?xml version="1.0" encoding="utf-8"?>
+<Properties xmlns="http://schemas.openxmlformats.org/officeDocument/2006/extended-properties" xmlns:vt="http://schemas.openxmlformats.org/officeDocument/2006/docPropsVTypes">
+  <Template>Normal.dotm</Template>
+  <TotalTime>1</TotalTime>
+  <Pages>1</Pages>
+  <Words>438</Words>
+  <Characters>2500</Characters>
+  <Application>Microsoft Office Word</Application>
+  <DocSecurity>0</DocSecurity>
+  <Lines>20</Lines>
+  <Paragraphs>5</Paragraphs>
+  <ScaleCrop>false</ScaleCrop>
+  <HeadingPairs>
+    <vt:vector size="2" baseType="variant">
+      <vt:variant>
+        <vt:lpstr>Title</vt:lpstr>
+      </vt:variant>
+      <vt:variant>
+        <vt:i4>1</vt:i4>
+      </vt:variant>
+    </vt:vector>
+  </HeadingPairs>
+  <TitlesOfParts>
+    <vt:vector size="1" baseType="lpstr">
+      <vt:lpstr/>
+    </vt:vector>
+  </TitlesOfParts>
+  <Company/>
+  <LinksUpToDate>false</LinksUpToDate>
+  <CharactersWithSpaces>2933</CharactersWithSpaces>
+  <SharedDoc>false</SharedDoc>
+  <HyperlinksChanged>false</HyperlinksChanged>
+  <AppVersion>16.0000</AppVersion>
+</Properties>
+</file>
+
+<file path=docProps\core.xml><?xml version="1.0" encoding="utf-8"?>
+<cp:coreProperties xmlns:cp="http://schemas.openxmlformats.org/package/2006/metadata/core-properties" xmlns:dc="http://purl.org/dc/elements/1.1/" xmlns:dcterms="http://purl.org/dc/terms/" xmlns:dcmitype="http://purl.org/dc/dcmitype/" xmlns:xsi="http://www.w3.org/2001/XMLSchema-instance">
+  <dc:title/>
+  <dc:subject/>
+  <dc:creator>Un-named</dc:creator>
+  <cp:keywords/>
+  <dc:description/>
+  <cp:lastModifiedBy>Huy Hoàng</cp:lastModifiedBy>
+  <cp:revision>4</cp:revision>
+  <dcterms:created xsi:type="dcterms:W3CDTF">2026-08-10T12:24:00Z</dcterms:created>
+  <dcterms:modified xsi:type="dcterms:W3CDTF">2026-08-10T12:49:00Z</dcterms:modified>
+</cp:coreProperties>
+</file>
+
+<file path=word\document.xml><?xml version="1.0" encoding="utf-8"?>
+<w:document xmlns:w="http://schemas.openxmlformats.org/wordprocessingml/2006/main" xmlns:r="http://schemas.openxmlformats.org/officeDocument/2006/relationships" xmlns:w14="http://schemas.microsoft.com/office/word/2010/wordml">
   <w:body>
     <w:p>
       <w:pPr>
@@ -44,10 +94,7 @@
     </w:p>
     <w:p>
       <w:pPr>
-        <w:pBdr>
-          <w:bottom w:val="single" w:sz="16" w:space="8" w:color="042C53"/>
-        </w:pBdr>
-        <w:spacing w:after="200"/>
+        <w:spacing w:after="140"/>
         <w:jc w:val="center"/>
         <w:rPr>
           <w:sz w:val="22"/>
@@ -60,7 +107,15 @@
           <w:sz w:val="18"/>
           <w:szCs w:val="18"/>
         </w:rPr>
-        <w:t xml:space="preserve">Ho Chi Minh City, Vietnam   ·   +84 366 424 978   ·   </w:t>
+        <w:t xml:space="preserve">Ho Chi Minh City, Vietnam   ·   </w:t>
+      </w:r>
+      <w:r>
+        <w:rPr>
+          <w:color w:val="378ADD"/>
+          <w:sz w:val="18"/>
+          <w:szCs w:val="18"/>
+        </w:rPr>
+        <w:t xml:space="preserve">+84 366 424 978   ·   </w:t>
       </w:r>
       <w:hyperlink r:id="rId5" w:history="1">
         <w:r>
@@ -133,27 +188,31 @@
     </w:p>
     <w:p>
       <w:pPr>
-        <w:spacing w:after="220"/>
-        <w:rPr>
-          <w:sz w:val="32"/>
-          <w:szCs w:val="32"/>
-        </w:rPr>
-      </w:pPr>
-      <w:r>
-        <w:rPr>
-          <w:color w:val="2A3A4A"/>
-          <w:sz w:val="24"/>
-          <w:szCs w:val="24"/>
-        </w:rPr>
-        <w:t>3rd-year Software Engineering student, oriented toward Fullstack Development and DevOps. Hands-on experience building and operating a system for a small business in a real operating environment -covering design, backend/frontend development, and server administration.</w:t>
-      </w:r>
-    </w:p>
+        <w:pBdr>
+          <w:top w:val="single" w:sz="6" w:space="8" w:color="042C53"/>
+        </w:pBdr>
+        <w:spacing w:before="120" w:after="220"/>
+        <w:rPr>
+          <w:sz w:val="22"/>
+          <w:szCs w:val="22"/>
+        </w:rPr>
+      </w:pPr>
+      <w:r>
+        <w:rPr>
+          <w:color w:val="2A3A4A"/>
+          <w:sz w:val="18"/>
+          <w:szCs w:val="18"/>
+        </w:rPr>
+        <w:t>3rd-year Software Engineering student, oriented toward Fullstack Development and DevOps. Currently interning at Amazing Tech (Sep 2026 – Present, Remote) directly developing the ftacode.com web platform and ordering app. Proven experience building and operating production systems — covering UI/UX development, backend services, database design, and server administration.</w:t>
+      </w:r>
+    </w:p>
+    <!-- 1. EDUCATION -->
     <w:p>
       <w:pPr>
         <w:pBdr>
           <w:bottom w:val="single" w:sz="4" w:space="4" w:color="DFE7F0"/>
         </w:pBdr>
-        <w:spacing w:before="300" w:after="160"/>
+        <w:spacing w:before="240" w:after="160"/>
         <w:rPr>
           <w:sz w:val="22"/>
           <w:szCs w:val="22"/>
@@ -183,78 +242,40 @@
         <w:t>EDUCATION</w:t>
       </w:r>
     </w:p>
-    <w:tbl>
-      <w:tblPr>
-        <w:tblW w:w="9360" w:type="dxa"/>
-        <w:tblCellMar>
-          <w:left w:w="10" w:type="dxa"/>
-          <w:right w:w="10" w:type="dxa"/>
-        </w:tblCellMar>
-        <w:tblLook w:val="0000" w:firstRow="0" w:lastRow="0" w:firstColumn="0" w:lastColumn="0" w:noHBand="0" w:noVBand="0"/>
-      </w:tblPr>
-      <w:tblGrid>
-        <w:gridCol w:w="6800"/>
-        <w:gridCol w:w="2560"/>
-      </w:tblGrid>
-      <w:tr>
-        <w:tc>
-          <w:tcPr>
-            <w:tcW w:w="6800" w:type="dxa"/>
-            <w:tcMar>
-              <w:top w:w="0" w:type="dxa"/>
-              <w:left w:w="0" w:type="dxa"/>
-              <w:bottom w:w="0" w:type="dxa"/>
-              <w:right w:w="0" w:type="dxa"/>
-            </w:tcMar>
-          </w:tcPr>
-          <w:p>
-            <w:pPr>
-              <w:rPr>
-                <w:sz w:val="22"/>
-                <w:szCs w:val="22"/>
-              </w:rPr>
-            </w:pPr>
-            <w:r>
-              <w:rPr>
-                <w:rFonts w:ascii="Arial" w:eastAsia="Arial" w:hAnsi="Arial" w:cs="Arial"/>
-                <w:b/>
-                <w:bCs/>
-                <w:color w:val="042C53"/>
-              </w:rPr>
-              <w:t>FPT University - Ho Chi Minh City</w:t>
-            </w:r>
-          </w:p>
-        </w:tc>
-        <w:tc>
-          <w:tcPr>
-            <w:tcW w:w="2560" w:type="dxa"/>
-            <w:tcMar>
-              <w:top w:w="0" w:type="dxa"/>
-              <w:left w:w="0" w:type="dxa"/>
-              <w:bottom w:w="0" w:type="dxa"/>
-              <w:right w:w="0" w:type="dxa"/>
-            </w:tcMar>
-          </w:tcPr>
-          <w:p>
-            <w:pPr>
-              <w:jc w:val="right"/>
-              <w:rPr>
-                <w:sz w:val="22"/>
-                <w:szCs w:val="22"/>
-              </w:rPr>
-            </w:pPr>
-            <w:r>
-              <w:rPr>
-                <w:color w:val="5F6B7A"/>
-                <w:sz w:val="18"/>
-                <w:szCs w:val="18"/>
-              </w:rPr>
-              <w:t>Sep 2023 – Present</w:t>
-            </w:r>
-          </w:p>
-        </w:tc>
-      </w:tr>
-    </w:tbl>
+    <w:p>
+      <w:pPr>
+        <w:rPr>
+          <w:sz w:val="22"/>
+          <w:szCs w:val="22"/>
+        </w:rPr>
+      </w:pPr>
+      <w:r>
+        <w:rPr>
+          <w:rFonts w:ascii="Arial" w:eastAsia="Arial" w:hAnsi="Arial" w:cs="Arial"/>
+          <w:b/>
+          <w:bCs/>
+          <w:color w:val="042C53"/>
+        </w:rPr>
+        <w:t>FPT University - Ho Chi Minh City</w:t>
+      </w:r>
+    </w:p>
+    <w:p>
+      <w:pPr>
+        <w:jc w:val="right"/>
+        <w:rPr>
+          <w:sz w:val="22"/>
+          <w:szCs w:val="22"/>
+        </w:rPr>
+      </w:pPr>
+      <w:r>
+        <w:rPr>
+          <w:color w:val="5F6B7A"/>
+          <w:sz w:val="18"/>
+          <w:szCs w:val="18"/>
+        </w:rPr>
+        <w:t>Sep 2023 – Present</w:t>
+      </w:r>
+    </w:p>
     <w:p>
       <w:pPr>
         <w:spacing w:before="40" w:after="100"/>
@@ -318,12 +339,13 @@
         <w:t>Studying Japanese as a 3rd language within the program.</w:t>
       </w:r>
     </w:p>
+    <!-- 2. WORK EXPERIENCE & PROJECTS -->
     <w:p>
       <w:pPr>
         <w:pBdr>
           <w:bottom w:val="single" w:sz="4" w:space="4" w:color="DFE7F0"/>
         </w:pBdr>
-        <w:spacing w:before="300" w:after="160"/>
+        <w:spacing w:before="240" w:after="160"/>
         <w:rPr>
           <w:sz w:val="22"/>
           <w:szCs w:val="22"/>
@@ -353,78 +375,41 @@
         <w:t>WORK EXPERIENCE &amp; PROJECTS</w:t>
       </w:r>
     </w:p>
-    <w:tbl>
-      <w:tblPr>
-        <w:tblW w:w="9360" w:type="dxa"/>
-        <w:tblCellMar>
-          <w:left w:w="10" w:type="dxa"/>
-          <w:right w:w="10" w:type="dxa"/>
-        </w:tblCellMar>
-        <w:tblLook w:val="0000" w:firstRow="0" w:lastRow="0" w:firstColumn="0" w:lastColumn="0" w:noHBand="0" w:noVBand="0"/>
-      </w:tblPr>
-      <w:tblGrid>
-        <w:gridCol w:w="6800"/>
-        <w:gridCol w:w="2560"/>
-      </w:tblGrid>
-      <w:tr>
-        <w:tc>
-          <w:tcPr>
-            <w:tcW w:w="6800" w:type="dxa"/>
-            <w:tcMar>
-              <w:top w:w="0" w:type="dxa"/>
-              <w:left w:w="0" w:type="dxa"/>
-              <w:bottom w:w="0" w:type="dxa"/>
-              <w:right w:w="0" w:type="dxa"/>
-            </w:tcMar>
-          </w:tcPr>
-          <w:p>
-            <w:pPr>
-              <w:rPr>
-                <w:sz w:val="22"/>
-                <w:szCs w:val="22"/>
-              </w:rPr>
-            </w:pPr>
-            <w:r>
-              <w:rPr>
-                <w:rFonts w:ascii="Arial" w:eastAsia="Arial" w:hAnsi="Arial" w:cs="Arial"/>
-                <w:b/>
-                <w:bCs/>
-                <w:color w:val="042C53"/>
-              </w:rPr>
-              <w:t>Software Engineer Intern (Remote) - Backend, Frontend &amp; DevOps</w:t>
-            </w:r>
-          </w:p>
-        </w:tc>
-        <w:tc>
-          <w:tcPr>
-            <w:tcW w:w="2560" w:type="dxa"/>
-            <w:tcMar>
-              <w:top w:w="0" w:type="dxa"/>
-              <w:left w:w="0" w:type="dxa"/>
-              <w:bottom w:w="0" w:type="dxa"/>
-              <w:right w:w="0" w:type="dxa"/>
-            </w:tcMar>
-          </w:tcPr>
-          <w:p>
-            <w:pPr>
-              <w:jc w:val="right"/>
-              <w:rPr>
-                <w:sz w:val="22"/>
-                <w:szCs w:val="22"/>
-              </w:rPr>
-            </w:pPr>
-            <w:r>
-              <w:rPr>
-                <w:color w:val="5F6B7A"/>
-                <w:sz w:val="18"/>
-                <w:szCs w:val="18"/>
-              </w:rPr>
-              <w:t>Apr 2026 – Present</w:t>
-            </w:r>
-          </w:p>
-        </w:tc>
-      </w:tr>
-    </w:tbl>
+    <!-- AMAZING TECH -->
+    <w:p>
+      <w:pPr>
+        <w:rPr>
+          <w:sz w:val="22"/>
+          <w:szCs w:val="22"/>
+        </w:rPr>
+      </w:pPr>
+      <w:r>
+        <w:rPr>
+          <w:rFonts w:ascii="Arial" w:eastAsia="Arial" w:hAnsi="Arial" w:cs="Arial"/>
+          <w:b/>
+          <w:bCs/>
+          <w:color w:val="042C53"/>
+        </w:rPr>
+        <w:t>Software Engineer Intern (Remote) - Full-stack Developer</w:t>
+      </w:r>
+    </w:p>
+    <w:p>
+      <w:pPr>
+        <w:jc w:val="right"/>
+        <w:rPr>
+          <w:sz w:val="22"/>
+          <w:szCs w:val="22"/>
+        </w:rPr>
+      </w:pPr>
+      <w:r>
+        <w:rPr>
+          <w:color w:val="5F6B7A"/>
+          <w:sz w:val="18"/>
+          <w:szCs w:val="18"/>
+        </w:rPr>
+        <w:t>Sep 2026 – Present</w:t>
+      </w:r>
+    </w:p>
     <w:p>
       <w:pPr>
         <w:spacing w:before="40" w:after="100"/>
@@ -441,7 +426,7 @@
           <w:sz w:val="18"/>
           <w:szCs w:val="18"/>
         </w:rPr>
-        <w:t>Công ty TNHH MTV Vận Tải Xuân Tín Logistics</w:t>
+        <w:t>Amazing Tech</w:t>
       </w:r>
     </w:p>
     <w:p>
@@ -460,7 +445,7 @@
           <w:sz w:val="18"/>
           <w:szCs w:val="18"/>
         </w:rPr>
-        <w:t>Internal Delivery Management System:</w:t>
+        <w:t>Website ftacode.com:</w:t>
       </w:r>
     </w:p>
     <w:p>
@@ -482,7 +467,26 @@
           <w:sz w:val="18"/>
           <w:szCs w:val="18"/>
         </w:rPr>
-        <w:t>Designed the system architecture and database schema from scratch for order intake, shipment tracking, delivery, and invoicing workflows.</w:t>
+        <w:t xml:space="preserve">Directly took charge of developing and deploying the official web platform for the ftacode brand (FtaCode Tacos) at </w:t>
+      </w:r>
+      <w:hyperlink r:id="rId15" w:history="1">
+        <w:r>
+          <w:rPr>
+            <w:color w:val="378ADD"/>
+            <w:sz w:val="18"/>
+            <w:szCs w:val="18"/>
+            <w:u w:val="single"/>
+          </w:rPr>
+          <w:t>ftacode.com</w:t>
+        </w:r>
+      </w:hyperlink>
+      <w:r>
+        <w:rPr>
+          <w:color w:val="2A3A4A"/>
+          <w:sz w:val="18"/>
+          <w:szCs w:val="18"/>
+        </w:rPr>
+        <w:t>.</w:t>
       </w:r>
     </w:p>
     <w:p>
@@ -504,33 +508,80 @@
           <w:sz w:val="18"/>
           <w:szCs w:val="18"/>
         </w:rPr>
-        <w:t xml:space="preserve">Built the backend with </w:t>
-      </w:r>
-      <w:r>
-        <w:rPr>
-          <w:b/>
-          <w:bCs/>
-          <w:color w:val="2A3A4A"/>
-          <w:sz w:val="18"/>
-          <w:szCs w:val="18"/>
-        </w:rPr>
-        <w:t>Razor Web (C#)</w:t>
-      </w:r>
-      <w:r>
-        <w:rPr>
-          <w:color w:val="2A3A4A"/>
-          <w:sz w:val="18"/>
-          <w:szCs w:val="18"/>
-        </w:rPr>
-        <w:t xml:space="preserve"> and RESTful endpoints</w:t>
-      </w:r>
-      <w:r>
-        <w:rPr>
-          <w:color w:val="2A3A4A"/>
-          <w:sz w:val="18"/>
-          <w:szCs w:val="18"/>
-        </w:rPr>
-        <w:t>.</w:t>
+        <w:t xml:space="preserve">Implemented modern responsive UI with </w:t>
+      </w:r>
+      <w:r>
+        <w:rPr>
+          <w:b/>
+          <w:bCs/>
+          <w:color w:val="2A3A4A"/>
+          <w:sz w:val="18"/>
+          <w:szCs w:val="18"/>
+        </w:rPr>
+        <w:t>React</w:t>
+      </w:r>
+      <w:r>
+        <w:rPr>
+          <w:color w:val="2A3A4A"/>
+          <w:sz w:val="18"/>
+          <w:szCs w:val="18"/>
+        </w:rPr>
+        <w:t xml:space="preserve">, </w:t>
+      </w:r>
+      <w:r>
+        <w:rPr>
+          <w:b/>
+          <w:bCs/>
+          <w:color w:val="2A3A4A"/>
+          <w:sz w:val="18"/>
+          <w:szCs w:val="18"/>
+        </w:rPr>
+        <w:t>Tailwind CSS</w:t>
+      </w:r>
+      <w:r>
+        <w:rPr>
+          <w:color w:val="2A3A4A"/>
+          <w:sz w:val="18"/>
+          <w:szCs w:val="18"/>
+        </w:rPr>
+        <w:t xml:space="preserve">, and </w:t>
+      </w:r>
+      <w:r>
+        <w:rPr>
+          <w:b/>
+          <w:bCs/>
+          <w:color w:val="2A3A4A"/>
+          <w:sz w:val="18"/>
+          <w:szCs w:val="18"/>
+        </w:rPr>
+        <w:t>JavaScript</w:t>
+      </w:r>
+      <w:r>
+        <w:rPr>
+          <w:color w:val="2A3A4A"/>
+          <w:sz w:val="18"/>
+          <w:szCs w:val="18"/>
+        </w:rPr>
+        <w:t>, focusing on fast loading, user interactions, and visual brand identity.</w:t>
+      </w:r>
+    </w:p>
+    <w:p>
+      <w:pPr>
+        <w:spacing w:before="60" w:after="40"/>
+        <w:rPr>
+          <w:sz w:val="18"/>
+          <w:szCs w:val="18"/>
+        </w:rPr>
+      </w:pPr>
+      <w:r>
+        <w:rPr>
+          <w:b/>
+          <w:bCs/>
+          <w:color w:val="042C53"/>
+          <w:sz w:val="18"/>
+          <w:szCs w:val="18"/>
+        </w:rPr>
+        <w:t>FTAcode Ordering Application:</w:t>
       </w:r>
     </w:p>
     <w:p>
@@ -552,43 +603,43 @@
           <w:sz w:val="18"/>
           <w:szCs w:val="18"/>
         </w:rPr>
-        <w:t xml:space="preserve">Used </w:t>
-      </w:r>
-      <w:r>
-        <w:rPr>
-          <w:b/>
-          <w:bCs/>
-          <w:color w:val="2A3A4A"/>
-          <w:sz w:val="18"/>
-          <w:szCs w:val="18"/>
-        </w:rPr>
-        <w:t>MySQL</w:t>
-      </w:r>
-      <w:r>
-        <w:rPr>
-          <w:color w:val="2A3A4A"/>
-          <w:sz w:val="18"/>
-          <w:szCs w:val="18"/>
-        </w:rPr>
-        <w:t xml:space="preserve"> for data storage and </w:t>
-      </w:r>
-      <w:r>
-        <w:rPr>
-          <w:b/>
-          <w:bCs/>
-          <w:color w:val="2A3A4A"/>
-          <w:sz w:val="18"/>
-          <w:szCs w:val="18"/>
-        </w:rPr>
-        <w:t>Docker</w:t>
-      </w:r>
-      <w:r>
-        <w:rPr>
-          <w:color w:val="2A3A4A"/>
-          <w:sz w:val="18"/>
-          <w:szCs w:val="18"/>
-        </w:rPr>
-        <w:t xml:space="preserve"> to containerize the application, ensuring consistent deployment across environments.</w:t>
+        <w:t xml:space="preserve">Directly developed the mobile ordering application for ftacode using </w:t>
+      </w:r>
+      <w:r>
+        <w:rPr>
+          <w:b/>
+          <w:bCs/>
+          <w:color w:val="2A3A4A"/>
+          <w:sz w:val="18"/>
+          <w:szCs w:val="18"/>
+        </w:rPr>
+        <w:t>React Native</w:t>
+      </w:r>
+      <w:r>
+        <w:rPr>
+          <w:color w:val="2A3A4A"/>
+          <w:sz w:val="18"/>
+          <w:szCs w:val="18"/>
+        </w:rPr>
+        <w:t xml:space="preserve"> and </w:t>
+      </w:r>
+      <w:r>
+        <w:rPr>
+          <w:b/>
+          <w:bCs/>
+          <w:color w:val="2A3A4A"/>
+          <w:sz w:val="18"/>
+          <w:szCs w:val="18"/>
+        </w:rPr>
+        <w:t>NativeWind</w:t>
+      </w:r>
+      <w:r>
+        <w:rPr>
+          <w:color w:val="2A3A4A"/>
+          <w:sz w:val="18"/>
+          <w:szCs w:val="18"/>
+        </w:rPr>
+        <w:t>, supporting food menu browsing, item customizations, cart management, and seamless order submission workflows.</w:t>
       </w:r>
     </w:p>
     <w:p>
@@ -610,7 +661,80 @@
           <w:sz w:val="18"/>
           <w:szCs w:val="18"/>
         </w:rPr>
-        <w:t>Provisioned the production server, configured the domain, and have owned deployment and ongoing maintenance since launch.</w:t>
+        <w:t xml:space="preserve">Integrated with backend </w:t>
+      </w:r>
+      <w:r>
+        <w:rPr>
+          <w:b/>
+          <w:bCs/>
+          <w:color w:val="2A3A4A"/>
+          <w:sz w:val="18"/>
+          <w:szCs w:val="18"/>
+        </w:rPr>
+        <w:t>RESTful APIs</w:t>
+      </w:r>
+      <w:r>
+        <w:rPr>
+          <w:color w:val="2A3A4A"/>
+          <w:sz w:val="18"/>
+          <w:szCs w:val="18"/>
+        </w:rPr>
+        <w:t> to ensure accurate and responsive real-time order processing.</w:t>
+      </w:r>
+    </w:p>
+    <!-- XUAN TIN LOGISTICS -->
+    <w:p>
+      <w:pPr>
+        <w:spacing w:before="120"/>
+        <w:rPr>
+          <w:sz w:val="22"/>
+          <w:szCs w:val="22"/>
+        </w:rPr>
+      </w:pPr>
+      <w:r>
+        <w:rPr>
+          <w:rFonts w:ascii="Arial" w:eastAsia="Arial" w:hAnsi="Arial" w:cs="Arial"/>
+          <w:b/>
+          <w:bCs/>
+          <w:color w:val="042C53"/>
+        </w:rPr>
+        <w:t>Software Engineer Intern (Remote) - Backend, Frontend &amp; DevOps</w:t>
+      </w:r>
+    </w:p>
+    <w:p>
+      <w:pPr>
+        <w:jc w:val="right"/>
+        <w:rPr>
+          <w:sz w:val="22"/>
+          <w:szCs w:val="22"/>
+        </w:rPr>
+      </w:pPr>
+      <w:r>
+        <w:rPr>
+          <w:color w:val="5F6B7A"/>
+          <w:sz w:val="18"/>
+          <w:szCs w:val="18"/>
+        </w:rPr>
+        <w:t>Apr 2026 – Aug 2026</w:t>
+      </w:r>
+    </w:p>
+    <w:p>
+      <w:pPr>
+        <w:spacing w:before="40" w:after="100"/>
+        <w:rPr>
+          <w:sz w:val="22"/>
+          <w:szCs w:val="22"/>
+        </w:rPr>
+      </w:pPr>
+      <w:r>
+        <w:rPr>
+          <w:b/>
+          <w:bCs/>
+          <w:color w:val="378ADD"/>
+          <w:sz w:val="18"/>
+          <w:szCs w:val="18"/>
+        </w:rPr>
+        <w:t>Công ty TNHH MTV Vận Tải Xuân Tín Logistics</w:t>
       </w:r>
     </w:p>
     <w:p>
@@ -629,7 +753,7 @@
           <w:sz w:val="18"/>
           <w:szCs w:val="18"/>
         </w:rPr>
-        <w:t>Company Website (Landing Page):</w:t>
+        <w:t>Internal Delivery Management System:</w:t>
       </w:r>
     </w:p>
     <w:p>
@@ -651,7 +775,168 @@
           <w:sz w:val="18"/>
           <w:szCs w:val="18"/>
         </w:rPr>
-        <w:t>Built a multi-page company website (</w:t>
+        <w:t>Designed the system architecture and database schema from scratch for order intake, shipment tracking, delivery, and invoicing workflows.</w:t>
+      </w:r>
+    </w:p>
+    <w:p>
+      <w:pPr>
+        <w:pStyle w:val="ListParagraph"/>
+        <w:numPr>
+          <w:ilvl w:val="0"/>
+          <w:numId w:val="2"/>
+        </w:numPr>
+        <w:spacing w:after="60"/>
+        <w:rPr>
+          <w:sz w:val="22"/>
+          <w:szCs w:val="22"/>
+        </w:rPr>
+      </w:pPr>
+      <w:r>
+        <w:rPr>
+          <w:color w:val="2A3A4A"/>
+          <w:sz w:val="18"/>
+          <w:szCs w:val="18"/>
+        </w:rPr>
+        <w:t xml:space="preserve">Built the backend with </w:t>
+      </w:r>
+      <w:r>
+        <w:rPr>
+          <w:b/>
+          <w:bCs/>
+          <w:color w:val="2A3A4A"/>
+          <w:sz w:val="18"/>
+          <w:szCs w:val="18"/>
+        </w:rPr>
+        <w:t>Razor Web (C#)</w:t>
+      </w:r>
+      <w:r>
+        <w:rPr>
+          <w:color w:val="2A3A4A"/>
+          <w:sz w:val="18"/>
+          <w:szCs w:val="18"/>
+        </w:rPr>
+        <w:t xml:space="preserve"> and RESTful endpoints.</w:t>
+      </w:r>
+    </w:p>
+    <w:p>
+      <w:pPr>
+        <w:pStyle w:val="ListParagraph"/>
+        <w:numPr>
+          <w:ilvl w:val="0"/>
+          <w:numId w:val="2"/>
+        </w:numPr>
+        <w:spacing w:after="60"/>
+        <w:rPr>
+          <w:sz w:val="22"/>
+          <w:szCs w:val="22"/>
+        </w:rPr>
+      </w:pPr>
+      <w:r>
+        <w:rPr>
+          <w:color w:val="2A3A4A"/>
+          <w:sz w:val="18"/>
+          <w:szCs w:val="18"/>
+        </w:rPr>
+        <w:t xml:space="preserve">Used </w:t>
+      </w:r>
+      <w:r>
+        <w:rPr>
+          <w:b/>
+          <w:bCs/>
+          <w:color w:val="2A3A4A"/>
+          <w:sz w:val="18"/>
+          <w:szCs w:val="18"/>
+        </w:rPr>
+        <w:t>MySQL</w:t>
+      </w:r>
+      <w:r>
+        <w:rPr>
+          <w:color w:val="2A3A4A"/>
+          <w:sz w:val="18"/>
+          <w:szCs w:val="18"/>
+        </w:rPr>
+        <w:t xml:space="preserve"> for data storage and </w:t>
+      </w:r>
+      <w:r>
+        <w:rPr>
+          <w:b/>
+          <w:bCs/>
+          <w:color w:val="2A3A4A"/>
+          <w:sz w:val="18"/>
+          <w:szCs w:val="18"/>
+        </w:rPr>
+        <w:t>Docker</w:t>
+      </w:r>
+      <w:r>
+        <w:rPr>
+          <w:color w:val="2A3A4A"/>
+          <w:sz w:val="18"/>
+          <w:szCs w:val="18"/>
+        </w:rPr>
+        <w:t xml:space="preserve"> to containerize the application, ensuring consistent deployment across environments.</w:t>
+      </w:r>
+    </w:p>
+    <w:p>
+      <w:pPr>
+        <w:pStyle w:val="ListParagraph"/>
+        <w:numPr>
+          <w:ilvl w:val="0"/>
+          <w:numId w:val="2"/>
+        </w:numPr>
+        <w:spacing w:after="60"/>
+        <w:rPr>
+          <w:sz w:val="22"/>
+          <w:szCs w:val="22"/>
+        </w:rPr>
+      </w:pPr>
+      <w:r>
+        <w:rPr>
+          <w:color w:val="2A3A4A"/>
+          <w:sz w:val="18"/>
+          <w:szCs w:val="18"/>
+        </w:rPr>
+        <w:t>Provisioned the production server, configured the domain, and have owned deployment and ongoing maintenance since launch.</w:t>
+      </w:r>
+    </w:p>
+    <w:p>
+      <w:pPr>
+        <w:spacing w:before="60" w:after="40"/>
+        <w:rPr>
+          <w:sz w:val="18"/>
+          <w:szCs w:val="18"/>
+        </w:rPr>
+      </w:pPr>
+      <w:r>
+        <w:rPr>
+          <w:b/>
+          <w:bCs/>
+          <w:color w:val="042C53"/>
+          <w:sz w:val="18"/>
+          <w:szCs w:val="18"/>
+        </w:rPr>
+        <w:t>Company Website (Landing Page):</w:t>
+      </w:r>
+    </w:p>
+    <w:p>
+      <w:pPr>
+        <w:pStyle w:val="ListParagraph"/>
+        <w:numPr>
+          <w:ilvl w:val="0"/>
+          <w:numId w:val="2"/>
+        </w:numPr>
+        <w:spacing w:after="60"/>
+        <w:rPr>
+          <w:sz w:val="22"/>
+          <w:szCs w:val="22"/>
+        </w:rPr>
+      </w:pPr>
+      <w:r>
+        <w:rPr>
+          <w:color w:val="2A3A4A"/>
+          <w:sz w:val="18"/>
+          <w:szCs w:val="18"/>
+        </w:rPr>
+        <w:t xml:space="preserve">Built a multi-page company website (</w:t>
       </w:r>
       <w:r>
         <w:rPr>
@@ -727,78 +1012,42 @@
         <w:t>.</w:t>
       </w:r>
     </w:p>
-    <w:tbl>
-      <w:tblPr>
-        <w:tblW w:w="9360" w:type="dxa"/>
-        <w:tblCellMar>
-          <w:left w:w="10" w:type="dxa"/>
-          <w:right w:w="10" w:type="dxa"/>
-        </w:tblCellMar>
-        <w:tblLook w:val="0000" w:firstRow="0" w:lastRow="0" w:firstColumn="0" w:lastColumn="0" w:noHBand="0" w:noVBand="0"/>
-      </w:tblPr>
-      <w:tblGrid>
-        <w:gridCol w:w="6800"/>
-        <w:gridCol w:w="2560"/>
-      </w:tblGrid>
-      <w:tr>
-        <w:tc>
-          <w:tcPr>
-            <w:tcW w:w="6800" w:type="dxa"/>
-            <w:tcMar>
-              <w:top w:w="0" w:type="dxa"/>
-              <w:left w:w="0" w:type="dxa"/>
-              <w:bottom w:w="0" w:type="dxa"/>
-              <w:right w:w="0" w:type="dxa"/>
-            </w:tcMar>
-          </w:tcPr>
-          <w:p>
-            <w:pPr>
-              <w:rPr>
-                <w:sz w:val="22"/>
-                <w:szCs w:val="22"/>
-              </w:rPr>
-            </w:pPr>
-            <w:r>
-              <w:rPr>
-                <w:rFonts w:ascii="Arial" w:eastAsia="Arial" w:hAnsi="Arial" w:cs="Arial"/>
-                <w:b/>
-                <w:bCs/>
-                <w:color w:val="042C53"/>
-              </w:rPr>
-              <w:t>Backend Developer · Coursework Team Project</w:t>
-            </w:r>
-          </w:p>
-        </w:tc>
-        <w:tc>
-          <w:tcPr>
-            <w:tcW w:w="2560" w:type="dxa"/>
-            <w:tcMar>
-              <w:top w:w="0" w:type="dxa"/>
-              <w:left w:w="0" w:type="dxa"/>
-              <w:bottom w:w="0" w:type="dxa"/>
-              <w:right w:w="0" w:type="dxa"/>
-            </w:tcMar>
-          </w:tcPr>
-          <w:p>
-            <w:pPr>
-              <w:jc w:val="right"/>
-              <w:rPr>
-                <w:sz w:val="22"/>
-                <w:szCs w:val="22"/>
-              </w:rPr>
-            </w:pPr>
-            <w:r>
-              <w:rPr>
-                <w:color w:val="5F6B7A"/>
-                <w:sz w:val="18"/>
-                <w:szCs w:val="18"/>
-              </w:rPr>
-              <w:t>05/2026</w:t>
-            </w:r>
-          </w:p>
-        </w:tc>
-      </w:tr>
-    </w:tbl>
+    <!-- AUTOWASH PRO -->
+    <w:p>
+      <w:pPr>
+        <w:spacing w:before="120"/>
+        <w:rPr>
+          <w:sz w:val="22"/>
+          <w:szCs w:val="22"/>
+        </w:rPr>
+      </w:pPr>
+      <w:r>
+        <w:rPr>
+          <w:rFonts w:ascii="Arial" w:eastAsia="Arial" w:hAnsi="Arial" w:cs="Arial"/>
+          <w:b/>
+          <w:bCs/>
+          <w:color w:val="042C53"/>
+        </w:rPr>
+        <w:t>Backend Developer · Coursework Team Project</w:t>
+      </w:r>
+    </w:p>
+    <w:p>
+      <w:pPr>
+        <w:jc w:val="right"/>
+        <w:rPr>
+          <w:sz w:val="22"/>
+          <w:szCs w:val="22"/>
+        </w:rPr>
+      </w:pPr>
+      <w:r>
+        <w:rPr>
+          <w:color w:val="5F6B7A"/>
+          <w:sz w:val="18"/>
+          <w:szCs w:val="18"/>
+        </w:rPr>
+        <w:t>05/2026</w:t>
+      </w:r>
+    </w:p>
     <w:p>
       <w:pPr>
         <w:spacing w:before="40" w:after="100"/>
@@ -877,7 +1126,7 @@
           <w:sz w:val="18"/>
           <w:szCs w:val="18"/>
         </w:rPr>
-        <w:t xml:space="preserve"> for booking management, service catalog, and scheduling logic.</w:t>
+        <w:t> for booking management, service catalog, and scheduling logic.</w:t>
       </w:r>
     </w:p>
     <w:p>
@@ -913,6 +1162,7 @@
         </w:r>
       </w:hyperlink>
     </w:p>
+    <!-- 3. JOB-RELATED SKILLS -->
     <w:p>
       <w:pPr>
         <w:pBdr>
@@ -951,11 +1201,13 @@
     <w:tbl>
       <w:tblPr>
         <w:tblW w:w="9360" w:type="dxa"/>
+        <w:tblLayout w:type="fixed"/>
         <w:tblCellMar>
-          <w:left w:w="10" w:type="dxa"/>
-          <w:right w:w="10" w:type="dxa"/>
+          <w:top w:w="0" w:type="dxa"/>
+          <w:left w:w="0" w:type="dxa"/>
+          <w:bottom w:w="40" w:type="dxa"/>
+          <w:right w:w="0" w:type="dxa"/>
         </w:tblCellMar>
-        <w:tblLook w:val="0000" w:firstRow="0" w:lastRow="0" w:firstColumn="0" w:lastColumn="0" w:noHBand="0" w:noVBand="0"/>
       </w:tblPr>
       <w:tblGrid>
         <w:gridCol w:w="2200"/>
@@ -965,20 +1217,8 @@
         <w:tc>
           <w:tcPr>
             <w:tcW w:w="2200" w:type="dxa"/>
-            <w:tcMar>
-              <w:top w:w="0" w:type="dxa"/>
-              <w:left w:w="0" w:type="dxa"/>
-              <w:bottom w:w="40" w:type="dxa"/>
-              <w:right w:w="0" w:type="dxa"/>
-            </w:tcMar>
           </w:tcPr>
           <w:p>
-            <w:pPr>
-              <w:rPr>
-                <w:sz w:val="22"/>
-                <w:szCs w:val="22"/>
-              </w:rPr>
-            </w:pPr>
             <w:r>
               <w:rPr>
                 <w:b/>
@@ -994,20 +1234,8 @@
         <w:tc>
           <w:tcPr>
             <w:tcW w:w="7160" w:type="dxa"/>
-            <w:tcMar>
-              <w:top w:w="0" w:type="dxa"/>
-              <w:left w:w="0" w:type="dxa"/>
-              <w:bottom w:w="40" w:type="dxa"/>
-              <w:right w:w="0" w:type="dxa"/>
-            </w:tcMar>
           </w:tcPr>
           <w:p>
-            <w:pPr>
-              <w:rPr>
-                <w:sz w:val="22"/>
-                <w:szCs w:val="22"/>
-              </w:rPr>
-            </w:pPr>
             <w:r>
               <w:rPr>
                 <w:color w:val="2A3A4A"/>
@@ -1023,20 +1251,8 @@
         <w:tc>
           <w:tcPr>
             <w:tcW w:w="2200" w:type="dxa"/>
-            <w:tcMar>
-              <w:top w:w="0" w:type="dxa"/>
-              <w:left w:w="0" w:type="dxa"/>
-              <w:bottom w:w="40" w:type="dxa"/>
-              <w:right w:w="0" w:type="dxa"/>
-            </w:tcMar>
           </w:tcPr>
           <w:p>
-            <w:pPr>
-              <w:rPr>
-                <w:sz w:val="22"/>
-                <w:szCs w:val="22"/>
-              </w:rPr>
-            </w:pPr>
             <w:r>
               <w:rPr>
                 <w:b/>
@@ -1052,27 +1268,15 @@
         <w:tc>
           <w:tcPr>
             <w:tcW w:w="7160" w:type="dxa"/>
-            <w:tcMar>
-              <w:top w:w="0" w:type="dxa"/>
-              <w:left w:w="0" w:type="dxa"/>
-              <w:bottom w:w="40" w:type="dxa"/>
-              <w:right w:w="0" w:type="dxa"/>
-            </w:tcMar>
           </w:tcPr>
           <w:p>
-            <w:pPr>
-              <w:rPr>
-                <w:sz w:val="22"/>
-                <w:szCs w:val="22"/>
-              </w:rPr>
-            </w:pPr>
             <w:r>
               <w:rPr>
                 <w:color w:val="2A3A4A"/>
                 <w:sz w:val="18"/>
                 <w:szCs w:val="18"/>
               </w:rPr>
-              <w:t>ASP.NET Core Web API, Razor Web, EF Core, React, Node.js</w:t>
+              <w:t>ASP.NET Core Web API, Razor Web, EF Core, React, React Native, NativeWind, Node.js</w:t>
             </w:r>
           </w:p>
         </w:tc>
@@ -1081,20 +1285,8 @@
         <w:tc>
           <w:tcPr>
             <w:tcW w:w="2200" w:type="dxa"/>
-            <w:tcMar>
-              <w:top w:w="0" w:type="dxa"/>
-              <w:left w:w="0" w:type="dxa"/>
-              <w:bottom w:w="40" w:type="dxa"/>
-              <w:right w:w="0" w:type="dxa"/>
-            </w:tcMar>
           </w:tcPr>
           <w:p>
-            <w:pPr>
-              <w:rPr>
-                <w:sz w:val="22"/>
-                <w:szCs w:val="22"/>
-              </w:rPr>
-            </w:pPr>
             <w:r>
               <w:rPr>
                 <w:b/>
@@ -1110,20 +1302,8 @@
         <w:tc>
           <w:tcPr>
             <w:tcW w:w="7160" w:type="dxa"/>
-            <w:tcMar>
-              <w:top w:w="0" w:type="dxa"/>
-              <w:left w:w="0" w:type="dxa"/>
-              <w:bottom w:w="40" w:type="dxa"/>
-              <w:right w:w="0" w:type="dxa"/>
-            </w:tcMar>
           </w:tcPr>
           <w:p>
-            <w:pPr>
-              <w:rPr>
-                <w:sz w:val="22"/>
-                <w:szCs w:val="22"/>
-              </w:rPr>
-            </w:pPr>
             <w:r>
               <w:rPr>
                 <w:color w:val="2A3A4A"/>
@@ -1139,20 +1319,8 @@
         <w:tc>
           <w:tcPr>
             <w:tcW w:w="2200" w:type="dxa"/>
-            <w:tcMar>
-              <w:top w:w="0" w:type="dxa"/>
-              <w:left w:w="0" w:type="dxa"/>
-              <w:bottom w:w="40" w:type="dxa"/>
-              <w:right w:w="0" w:type="dxa"/>
-            </w:tcMar>
           </w:tcPr>
           <w:p>
-            <w:pPr>
-              <w:rPr>
-                <w:sz w:val="22"/>
-                <w:szCs w:val="22"/>
-              </w:rPr>
-            </w:pPr>
             <w:r>
               <w:rPr>
                 <w:b/>
@@ -1168,20 +1336,8 @@
         <w:tc>
           <w:tcPr>
             <w:tcW w:w="7160" w:type="dxa"/>
-            <w:tcMar>
-              <w:top w:w="0" w:type="dxa"/>
-              <w:left w:w="0" w:type="dxa"/>
-              <w:bottom w:w="40" w:type="dxa"/>
-              <w:right w:w="0" w:type="dxa"/>
-            </w:tcMar>
           </w:tcPr>
           <w:p>
-            <w:pPr>
-              <w:rPr>
-                <w:sz w:val="22"/>
-                <w:szCs w:val="22"/>
-              </w:rPr>
-            </w:pPr>
             <w:r>
               <w:rPr>
                 <w:color w:val="2A3A4A"/>
@@ -1197,20 +1353,8 @@
         <w:tc>
           <w:tcPr>
             <w:tcW w:w="2200" w:type="dxa"/>
-            <w:tcMar>
-              <w:top w:w="0" w:type="dxa"/>
-              <w:left w:w="0" w:type="dxa"/>
-              <w:bottom w:w="40" w:type="dxa"/>
-              <w:right w:w="0" w:type="dxa"/>
-            </w:tcMar>
           </w:tcPr>
           <w:p>
-            <w:pPr>
-              <w:rPr>
-                <w:sz w:val="22"/>
-                <w:szCs w:val="22"/>
-              </w:rPr>
-            </w:pPr>
             <w:r>
               <w:rPr>
                 <w:b/>
@@ -1226,20 +1370,8 @@
         <w:tc>
           <w:tcPr>
             <w:tcW w:w="7160" w:type="dxa"/>
-            <w:tcMar>
-              <w:top w:w="0" w:type="dxa"/>
-              <w:left w:w="0" w:type="dxa"/>
-              <w:bottom w:w="40" w:type="dxa"/>
-              <w:right w:w="0" w:type="dxa"/>
-            </w:tcMar>
           </w:tcPr>
           <w:p>
-            <w:pPr>
-              <w:rPr>
-                <w:sz w:val="22"/>
-                <w:szCs w:val="22"/>
-              </w:rPr>
-            </w:pPr>
             <w:r>
               <w:rPr>
                 <w:color w:val="2A3A4A"/>
@@ -1255,20 +1387,8 @@
         <w:tc>
           <w:tcPr>
             <w:tcW w:w="2200" w:type="dxa"/>
-            <w:tcMar>
-              <w:top w:w="0" w:type="dxa"/>
-              <w:left w:w="0" w:type="dxa"/>
-              <w:bottom w:w="40" w:type="dxa"/>
-              <w:right w:w="0" w:type="dxa"/>
-            </w:tcMar>
           </w:tcPr>
           <w:p>
-            <w:pPr>
-              <w:rPr>
-                <w:sz w:val="22"/>
-                <w:szCs w:val="22"/>
-              </w:rPr>
-            </w:pPr>
             <w:r>
               <w:rPr>
                 <w:b/>
@@ -1284,20 +1404,8 @@
         <w:tc>
           <w:tcPr>
             <w:tcW w:w="7160" w:type="dxa"/>
-            <w:tcMar>
-              <w:top w:w="0" w:type="dxa"/>
-              <w:left w:w="0" w:type="dxa"/>
-              <w:bottom w:w="40" w:type="dxa"/>
-              <w:right w:w="0" w:type="dxa"/>
-            </w:tcMar>
           </w:tcPr>
           <w:p>
-            <w:pPr>
-              <w:rPr>
-                <w:sz w:val="22"/>
-                <w:szCs w:val="22"/>
-              </w:rPr>
-            </w:pPr>
             <w:r>
               <w:rPr>
                 <w:color w:val="2A3A4A"/>
@@ -1310,6 +1418,7 @@
         </w:tc>
       </w:tr>
     </w:tbl>
+    <!-- 4. ACCOMPLISHMENTS -->
     <w:p>
       <w:pPr>
         <w:pBdr>
@@ -1366,15 +1475,15 @@
           <w:sz w:val="18"/>
           <w:szCs w:val="18"/>
         </w:rPr>
-        <w:t xml:space="preserve">Year-3 Internship: </w:t>
-      </w:r>
-      <w:r>
-        <w:rPr>
-          <w:color w:val="2A3A4A"/>
-          <w:sz w:val="18"/>
-          <w:szCs w:val="18"/>
-        </w:rPr>
-        <w:t>Began interning at a real company in year 3, directly involved in operating a production system.</w:t>
+        <w:t xml:space="preserve">Production Web &amp; App Delivery: </w:t>
+      </w:r>
+      <w:r>
+        <w:rPr>
+          <w:color w:val="2A3A4A"/>
+          <w:sz w:val="18"/>
+          <w:szCs w:val="18"/>
+        </w:rPr>
+        <w:t>Directly built and shipped the ftacode.com web platform and ordering app at Amazing Tech; built end-to-end production delivery systems at Xuan Tin Logistics.</w:t>
       </w:r>
     </w:p>
     <w:p>
@@ -1494,7 +1603,40 @@
 </w:document>
 </file>
 
-<file path=word/numbering.xml><?xml version="1.0" encoding="utf-8"?>
+<file path=word\fontTable.xml><?xml version="1.0" encoding="utf-8"?>
+<w:fonts xmlns:mc="http://schemas.openxmlformats.org/markup-compatibility/2006" xmlns:r="http://schemas.openxmlformats.org/officeDocument/2006/relationships" xmlns:w="http://schemas.openxmlformats.org/wordprocessingml/2006/main" xmlns:w14="http://schemas.microsoft.com/office/word/2010/wordml" xmlns:w15="http://schemas.microsoft.com/office/word/2012/wordml" xmlns:w16cex="http://schemas.microsoft.com/office/word/2018/wordml/cex" xmlns:w16cid="http://schemas.microsoft.com/office/word/2016/wordml/cid" xmlns:w16="http://schemas.microsoft.com/office/word/2018/wordml" xmlns:w16du="http://schemas.microsoft.com/office/word/2023/wordml/word16du" xmlns:w16sdtdh="http://schemas.microsoft.com/office/word/2020/wordml/sdtdatahash" xmlns:w16sdtfl="http://schemas.microsoft.com/office/word/2024/wordml/sdtformatlock" xmlns:w16se="http://schemas.microsoft.com/office/word/2015/wordml/symex" mc:Ignorable="w14 w15 w16se w16cid w16 w16cex w16sdtdh w16sdtfl w16du">
+  <w:font w:name="Times New Roman">
+    <w:panose1 w:val="02020603050405020304"/>
+    <w:charset w:val="00"/>
+    <w:family w:val="roman"/>
+    <w:pitch w:val="variable"/>
+    <w:sig w:usb0="E0002EFF" w:usb1="C000785B" w:usb2="00000009" w:usb3="00000000" w:csb0="000001FF" w:csb1="00000000"/>
+  </w:font>
+  <w:font w:name="Arial">
+    <w:panose1 w:val="020B0604020202020204"/>
+    <w:charset w:val="00"/>
+    <w:family w:val="swiss"/>
+    <w:pitch w:val="variable"/>
+    <w:sig w:usb0="E0002EFF" w:usb1="C000785B" w:usb2="00000009" w:usb3="00000000" w:csb0="000001FF" w:csb1="00000000"/>
+  </w:font>
+  <w:font w:name="Calibri Light">
+    <w:panose1 w:val="020F0302020204030204"/>
+    <w:charset w:val="00"/>
+    <w:family w:val="swiss"/>
+    <w:pitch w:val="variable"/>
+    <w:sig w:usb0="E4002EFF" w:usb1="C200247B" w:usb2="00000009" w:usb3="00000000" w:csb0="000001FF" w:csb1="00000000"/>
+  </w:font>
+  <w:font w:name="Calibri">
+    <w:panose1 w:val="020F0502020204030204"/>
+    <w:charset w:val="00"/>
+    <w:family w:val="swiss"/>
+    <w:pitch w:val="variable"/>
+    <w:sig w:usb0="E4002EFF" w:usb1="C200247B" w:usb2="00000009" w:usb3="00000000" w:csb0="000001FF" w:csb1="00000000"/>
+  </w:font>
+</w:fonts>
+</file>
+
+<file path=word\numbering.xml><?xml version="1.0" encoding="utf-8"?>
 <w:numbering xmlns:wpc="http://schemas.microsoft.com/office/word/2010/wordprocessingCanvas" xmlns:cx="http://schemas.microsoft.com/office/drawing/2014/chartex" xmlns:cx1="http://schemas.microsoft.com/office/drawing/2015/9/8/chartex" xmlns:cx2="http://schemas.microsoft.com/office/drawing/2015/10/21/chartex" xmlns:cx3="http://schemas.microsoft.com/office/drawing/2016/5/9/chartex" xmlns:cx4="http://schemas.microsoft.com/office/drawing/2016/5/10/chartex" xmlns:cx5="http://schemas.microsoft.com/office/drawing/2016/5/11/chartex" xmlns:cx6="http://schemas.microsoft.com/office/drawing/2016/5/12/chartex" xmlns:cx7="http://schemas.microsoft.com/office/drawing/2016/5/13/chartex" xmlns:cx8="http://schemas.microsoft.com/office/drawing/2016/5/14/chartex" xmlns:mc="http://schemas.openxmlformats.org/markup-compatibility/2006" xmlns:aink="http://schemas.microsoft.com/office/drawing/2016/ink" xmlns:am3d="http://schemas.microsoft.com/office/drawing/2017/model3d" xmlns:o="urn:schemas-microsoft-com:office:office" xmlns:oel="http://schemas.microsoft.com/office/2019/extlst" xmlns:r="http://schemas.openxmlformats.org/officeDocument/2006/relationships" xmlns:m="http://schemas.openxmlformats.org/officeDocument/2006/math" xmlns:v="urn:schemas-microsoft-com:vml" xmlns:wp14="http://schemas.microsoft.com/office/word/2010/wordprocessingDrawing" xmlns:wp="http://schemas.openxmlformats.org/drawingml/2006/wordprocessingDrawing" xmlns:w10="urn:schemas-microsoft-com:office:word" xmlns:w="http://schemas.openxmlformats.org/wordprocessingml/2006/main" xmlns:w14="http://schemas.microsoft.com/office/word/2010/wordml" xmlns:w15="http://schemas.microsoft.com/office/word/2012/wordml" xmlns:w16cex="http://schemas.microsoft.com/office/word/2018/wordml/cex" xmlns:w16cid="http://schemas.microsoft.com/office/word/2016/wordml/cid" xmlns:w16="http://schemas.microsoft.com/office/word/2018/wordml" xmlns:w16du="http://schemas.microsoft.com/office/word/2023/wordml/word16du" xmlns:w16sdtdh="http://schemas.microsoft.com/office/word/2020/wordml/sdtdatahash" xmlns:w16sdtfl="http://schemas.microsoft.com/office/word/2024/wordml/sdtformatlock" xmlns:w16se="http://schemas.microsoft.com/office/word/2015/wordml/symex" xmlns:wpg="http://schemas.microsoft.com/office/word/2010/wordprocessingGroup" xmlns:wpi="http://schemas.microsoft.com/office/word/2010/wordprocessingInk" xmlns:wne="http://schemas.microsoft.com/office/word/2006/wordml" xmlns:wps="http://schemas.microsoft.com/office/word/2010/wordprocessingShape" mc:Ignorable="w14 w15 w16se w16cid w16 w16cex w16sdtdh w16sdtfl w16du wp14">
   <w:abstractNum w:abstractNumId="0" w15:restartNumberingAfterBreak="0">
     <w:nsid w:val="0E6578B9"/>
@@ -1651,7 +1793,62 @@
 </w:numbering>
 </file>
 
-<file path=word/styles.xml><?xml version="1.0" encoding="utf-8"?>
+<file path=word\settings.xml><?xml version="1.0" encoding="utf-8"?>
+<w:settings xmlns:mc="http://schemas.openxmlformats.org/markup-compatibility/2006" xmlns:o="urn:schemas-microsoft-com:office:office" xmlns:r="http://schemas.openxmlformats.org/officeDocument/2006/relationships" xmlns:m="http://schemas.openxmlformats.org/officeDocument/2006/math" xmlns:v="urn:schemas-microsoft-com:vml" xmlns:w10="urn:schemas-microsoft-com:office:word" xmlns:w="http://schemas.openxmlformats.org/wordprocessingml/2006/main" xmlns:w14="http://schemas.microsoft.com/office/word/2010/wordml" xmlns:w15="http://schemas.microsoft.com/office/word/2012/wordml" xmlns:w16cex="http://schemas.microsoft.com/office/word/2018/wordml/cex" xmlns:w16cid="http://schemas.microsoft.com/office/word/2016/wordml/cid" xmlns:w16="http://schemas.microsoft.com/office/word/2018/wordml" xmlns:w16du="http://schemas.microsoft.com/office/word/2023/wordml/word16du" xmlns:w16sdtdh="http://schemas.microsoft.com/office/word/2020/wordml/sdtdatahash" xmlns:w16sdtfl="http://schemas.microsoft.com/office/word/2024/wordml/sdtformatlock" xmlns:w16se="http://schemas.microsoft.com/office/word/2015/wordml/symex" xmlns:sl="http://schemas.openxmlformats.org/schemaLibrary/2006/main" mc:Ignorable="w14 w15 w16se w16cid w16 w16cex w16sdtdh w16sdtfl w16du">
+  <w:zoom w:percent="130"/>
+  <w:displayBackgroundShape/>
+  <w:defaultTabStop w:val="720"/>
+  <w:characterSpacingControl w:val="doNotCompress"/>
+  <w:compat>
+    <w:compatSetting w:name="compatibilityMode" w:uri="http://schemas.microsoft.com/office/word" w:val="15"/>
+    <w:compatSetting w:name="overrideTableStyleFontSizeAndJustification" w:uri="http://schemas.microsoft.com/office/word" w:val="1"/>
+    <w:compatSetting w:name="enableOpenTypeFeatures" w:uri="http://schemas.microsoft.com/office/word" w:val="1"/>
+    <w:compatSetting w:name="doNotFlipMirrorIndents" w:uri="http://schemas.microsoft.com/office/word" w:val="1"/>
+    <w:compatSetting w:name="differentiateMultirowTableHeaders" w:uri="http://schemas.microsoft.com/office/word" w:val="1"/>
+    <w:compatSetting w:name="useWord2013TrackBottomHyphenation" w:uri="http://schemas.microsoft.com/office/word" w:val="1"/>
+  </w:compat>
+  <w:rsids>
+    <w:rsidRoot w:val="00021779"/>
+    <w:rsid w:val="00021779"/>
+    <w:rsid w:val="000953F8"/>
+    <w:rsid w:val="00231262"/>
+    <w:rsid w:val="002911AC"/>
+    <w:rsid w:val="003C6EC4"/>
+    <w:rsid w:val="004904D4"/>
+    <w:rsid w:val="008E3418"/>
+    <w:rsid w:val="00954319"/>
+    <w:rsid w:val="009A69C9"/>
+    <w:rsid w:val="00AC6CFF"/>
+  </w:rsids>
+  <m:mathPr>
+    <m:mathFont m:val="Cambria Math"/>
+    <m:brkBin m:val="before"/>
+    <m:brkBinSub m:val="--"/>
+    <m:smallFrac m:val="0"/>
+    <m:dispDef/>
+    <m:lMargin m:val="0"/>
+    <m:rMargin m:val="0"/>
+    <m:defJc m:val="centerGroup"/>
+    <m:wrapIndent m:val="1440"/>
+    <m:intLim m:val="subSup"/>
+    <m:naryLim m:val="undOvr"/>
+  </m:mathPr>
+  <w:themeFontLang w:val="en-US"/>
+  <w:clrSchemeMapping w:bg1="light1" w:t1="dark1" w:bg2="light2" w:t2="dark2" w:accent1="accent1" w:accent2="accent2" w:accent3="accent3" w:accent4="accent4" w:accent5="accent5" w:accent6="accent6" w:hyperlink="hyperlink" w:followedHyperlink="followedHyperlink"/>
+  <w:shapeDefaults>
+    <o:shapedefaults v:ext="edit" spidmax="1026"/>
+    <o:shapelayout v:ext="edit">
+      <o:idmap v:ext="edit" data="1"/>
+    </o:shapelayout>
+  </w:shapeDefaults>
+  <w:decimalSymbol w:val="."/>
+  <w:listSeparator w:val=","/>
+  <w14:docId w14:val="7B2F3A3F"/>
+  <w15:docId w15:val="{31DE3D64-A132-48B5-A1C0-77E551207E47}"/>
+</w:settings>
+</file>
+
+<file path=word\styles.xml><?xml version="1.0" encoding="utf-8"?>
 <w:styles xmlns:mc="http://schemas.openxmlformats.org/markup-compatibility/2006" xmlns:r="http://schemas.openxmlformats.org/officeDocument/2006/relationships" xmlns:w="http://schemas.openxmlformats.org/wordprocessingml/2006/main" xmlns:w14="http://schemas.microsoft.com/office/word/2010/wordml" xmlns:w15="http://schemas.microsoft.com/office/word/2012/wordml" xmlns:w16cex="http://schemas.microsoft.com/office/word/2018/wordml/cex" xmlns:w16cid="http://schemas.microsoft.com/office/word/2016/wordml/cid" xmlns:w16="http://schemas.microsoft.com/office/word/2018/wordml" xmlns:w16du="http://schemas.microsoft.com/office/word/2023/wordml/word16du" xmlns:w16sdtdh="http://schemas.microsoft.com/office/word/2020/wordml/sdtdatahash" xmlns:w16sdtfl="http://schemas.microsoft.com/office/word/2024/wordml/sdtformatlock" xmlns:w16se="http://schemas.microsoft.com/office/word/2015/wordml/symex" mc:Ignorable="w14 w15 w16se w16cid w16 w16cex w16sdtdh w16sdtfl w16du">
   <w:docDefaults>
     <w:rPrDefault>
@@ -2242,7 +2439,7 @@
 </w:styles>
 </file>
 
-<file path=word/theme/theme1.xml><?xml version="1.0" encoding="utf-8"?>
+<file path=word\theme\theme1.xml><?xml version="1.0" encoding="utf-8"?>
 <a:theme xmlns:a="http://schemas.openxmlformats.org/drawingml/2006/main" name="Office Theme">
   <a:themeElements>
     <a:clrScheme name="Office">
@@ -2535,4 +2732,8 @@
     </a:ext>
   </a:extLst>
 </a:theme>
+</file>
+
+<file path=word\webSettings.xml><?xml version="1.0" encoding="utf-8"?>
+<w:webSettings xmlns:mc="http://schemas.openxmlformats.org/markup-compatibility/2006" xmlns:r="http://schemas.openxmlformats.org/officeDocument/2006/relationships" xmlns:w="http://schemas.openxmlformats.org/wordprocessingml/2006/main" xmlns:w14="http://schemas.microsoft.com/office/word/2010/wordml" xmlns:w15="http://schemas.microsoft.com/office/word/2012/wordml" xmlns:w16cex="http://schemas.microsoft.com/office/word/2018/wordml/cex" xmlns:w16cid="http://schemas.microsoft.com/office/word/2016/wordml/cid" xmlns:w16="http://schemas.microsoft.com/office/word/2018/wordml" xmlns:w16du="http://schemas.microsoft.com/office/word/2023/wordml/word16du" xmlns:w16sdtdh="http://schemas.microsoft.com/office/word/2020/wordml/sdtdatahash" xmlns:w16sdtfl="http://schemas.microsoft.com/office/word/2024/wordml/sdtformatlock" xmlns:w16se="http://schemas.microsoft.com/office/word/2015/wordml/symex" mc:Ignorable="w14 w15 w16se w16cid w16 w16cex w16sdtdh w16sdtfl w16du"/>
 </file>
</xml_diff>

<commit_message>
feat: add Lucian #205 rippling letter motion to logo and hero name, replace em dashes with hyphens
</commit_message>
<xml_diff>
--- a/doc/CV_Software_Engineer_EN.docx
+++ b/doc/CV_Software_Engineer_EN.docx
@@ -203,7 +203,7 @@
           <w:sz w:val="18"/>
           <w:szCs w:val="18"/>
         </w:rPr>
-        <w:t>3rd-year Software Engineering student, oriented toward Fullstack Development and DevOps. Currently interning at Amazing Tech (Sep 2026 – Present, Remote) directly developing the ftacode.com web platform and ordering app. Proven experience building and operating production systems — covering UI/UX development, backend services, database design, and server administration.</w:t>
+        <w:t>3rd-year Software Engineering student, oriented toward Fullstack Development and DevOps. Currently interning at Amazing Tech (Sep 2026 – Present, Remote) directly developing the ftacode.com web platform and ordering app. Proven experience building and operating production systems - covering UI/UX development, backend services, database design, and server administration.</w:t>
       </w:r>
     </w:p>
     <!-- 1. EDUCATION -->
@@ -1558,7 +1558,7 @@
           <w:sz w:val="18"/>
           <w:szCs w:val="18"/>
         </w:rPr>
-        <w:t xml:space="preserve">Software Engineering (HKUST), Software Development Lifecycle (University of Minnesota) — Coursera</w:t>
+        <w:t xml:space="preserve">Software Engineering (HKUST), Software Development Lifecycle (University of Minnesota) - Coursera</w:t>
       </w:r>
     </w:p>
     <w:p>

</xml_diff>